<commit_message>
Publish complete deduplicated supplemental materials
</commit_message>
<xml_diff>
--- a/Supplemental_Methods_and_Tables.docx
+++ b/Supplemental_Methods_and_Tables.docx
@@ -1652,14 +1652,7 @@
                     <w:rFonts w:ascii="Cambria Math" w:hAnsi="Cambria Math"/>
                     <w:sz w:val="20"/>
                   </w:rPr>
-                  <m:t>{·</m:t>
-                </m:r>
-                <m:r>
-                  <w:rPr>
-                    <w:rFonts w:ascii="Cambria Math" w:hAnsi="Cambria Math"/>
-                    <w:sz w:val="20"/>
-                  </w:rPr>
-                  <m:t>}</m:t>
+                  <m:t>{·}</m:t>
                 </m:r>
               </m:oMath>
             </m:oMathPara>
@@ -2593,14 +2586,7 @@
                     <w:rFonts w:ascii="Cambria Math" w:hAnsi="Cambria Math"/>
                     <w:sz w:val="20"/>
                   </w:rPr>
-                  <m:t>(D</m:t>
-                </m:r>
-                <m:r>
-                  <w:rPr>
-                    <w:rFonts w:ascii="Cambria Math" w:hAnsi="Cambria Math"/>
-                    <w:sz w:val="20"/>
-                  </w:rPr>
-                  <m:t>)</m:t>
+                  <m:t>(D)</m:t>
                 </m:r>
               </m:oMath>
             </m:oMathPara>
@@ -2714,6 +2700,10 @@
       <w:pPr>
         <w:keepNext/>
         <w:spacing w:before="120"/>
+        <w:jc w:val="center"/>
+        <w:rPr>
+          <w:bCs/>
+        </w:rPr>
       </w:pPr>
       <w:r>
         <w:rPr>
@@ -2722,7 +2712,15 @@
           <w:sz w:val="20"/>
         </w:rPr>
         <w:lastRenderedPageBreak/>
-        <w:t>Table S1. Robustness and secondary checks</w:t>
+        <w:t xml:space="preserve">Table S1. </w:t>
+      </w:r>
+      <w:r>
+        <w:rPr>
+          <w:rFonts w:ascii="Times New Roman" w:hAnsi="Times New Roman"/>
+          <w:bCs/>
+          <w:sz w:val="20"/>
+        </w:rPr>
+        <w:t>Robustness and secondary checks</w:t>
       </w:r>
     </w:p>
     <w:tbl>
@@ -3298,6 +3296,10 @@
       <w:pPr>
         <w:keepNext/>
         <w:spacing w:before="120"/>
+        <w:jc w:val="center"/>
+        <w:rPr>
+          <w:bCs/>
+        </w:rPr>
       </w:pPr>
       <w:r>
         <w:rPr>
@@ -3305,7 +3307,15 @@
           <w:b/>
           <w:sz w:val="20"/>
         </w:rPr>
-        <w:t>Table S2. Objective-specific transfer and high-budget saturation</w:t>
+        <w:t xml:space="preserve">Table S2. </w:t>
+      </w:r>
+      <w:r>
+        <w:rPr>
+          <w:rFonts w:ascii="Times New Roman" w:hAnsi="Times New Roman"/>
+          <w:bCs/>
+          <w:sz w:val="20"/>
+        </w:rPr>
+        <w:t>Objective-specific transfer and high-budget saturation</w:t>
       </w:r>
     </w:p>
     <w:tbl>
@@ -4764,6 +4774,10 @@
       <w:pPr>
         <w:keepNext/>
         <w:spacing w:before="120"/>
+        <w:jc w:val="center"/>
+        <w:rPr>
+          <w:bCs/>
+        </w:rPr>
       </w:pPr>
       <w:r>
         <w:rPr>
@@ -4771,7 +4785,15 @@
           <w:b/>
           <w:sz w:val="20"/>
         </w:rPr>
-        <w:t>Table S3. Delft pile-level median paired NRMSE differences: primary linear, original-layout, 0.20-m-grid protocol</w:t>
+        <w:t xml:space="preserve">Table S3. </w:t>
+      </w:r>
+      <w:r>
+        <w:rPr>
+          <w:rFonts w:ascii="Times New Roman" w:hAnsi="Times New Roman"/>
+          <w:bCs/>
+          <w:sz w:val="20"/>
+        </w:rPr>
+        <w:t>Delft pile-level median paired NRMSE differences: primary linear, original-layout, 0.20-m-grid protocol</w:t>
       </w:r>
     </w:p>
     <w:tbl>
@@ -5672,6 +5694,10 @@
       <w:pPr>
         <w:keepNext/>
         <w:spacing w:before="120"/>
+        <w:jc w:val="center"/>
+        <w:rPr>
+          <w:bCs/>
+        </w:rPr>
       </w:pPr>
       <w:r>
         <w:rPr>
@@ -5680,7 +5706,15 @@
           <w:sz w:val="20"/>
         </w:rPr>
         <w:lastRenderedPageBreak/>
-        <w:t>Table S4. Graphical-resolution stress scenarios for 24 published-profile comparisons</w:t>
+        <w:t xml:space="preserve">Table S4. </w:t>
+      </w:r>
+      <w:r>
+        <w:rPr>
+          <w:rFonts w:ascii="Times New Roman" w:hAnsi="Times New Roman"/>
+          <w:bCs/>
+          <w:sz w:val="20"/>
+        </w:rPr>
+        <w:t>Graphical-resolution stress scenarios for 24 published-profile comparisons</w:t>
       </w:r>
     </w:p>
     <w:tbl>
@@ -6008,6 +6042,10 @@
       <w:pPr>
         <w:keepNext/>
         <w:spacing w:before="120"/>
+        <w:jc w:val="center"/>
+        <w:rPr>
+          <w:bCs/>
+        </w:rPr>
       </w:pPr>
       <w:r>
         <w:rPr>
@@ -6015,7 +6053,15 @@
           <w:b/>
           <w:sz w:val="20"/>
         </w:rPr>
-        <w:t>Table S5. Independent published-profile consistency relative to equal-budget uniform placement</w:t>
+        <w:t xml:space="preserve">Table S5. </w:t>
+      </w:r>
+      <w:r>
+        <w:rPr>
+          <w:rFonts w:ascii="Times New Roman" w:hAnsi="Times New Roman"/>
+          <w:bCs/>
+          <w:sz w:val="20"/>
+        </w:rPr>
+        <w:t>Independent published-profile consistency relative to equal-budget uniform placement</w:t>
       </w:r>
     </w:p>
     <w:tbl>
@@ -6890,6 +6936,7 @@
       <w:pPr>
         <w:keepNext/>
         <w:spacing w:before="120"/>
+        <w:jc w:val="center"/>
       </w:pPr>
       <w:r>
         <w:rPr>
@@ -6898,7 +6945,15 @@
           <w:sz w:val="20"/>
         </w:rPr>
         <w:lastRenderedPageBreak/>
-        <w:t>Table S6. Sampling, comparator-population and protocol-sensitivity summary</w:t>
+        <w:t xml:space="preserve">Table S6. </w:t>
+      </w:r>
+      <w:r>
+        <w:rPr>
+          <w:rFonts w:ascii="Times New Roman" w:hAnsi="Times New Roman"/>
+          <w:bCs/>
+          <w:sz w:val="20"/>
+        </w:rPr>
+        <w:t>Sampling, comparator-population and protocol-sensitivity summary</w:t>
       </w:r>
     </w:p>
     <w:tbl>
@@ -8503,6 +8558,10 @@
       <w:pPr>
         <w:keepNext/>
         <w:pageBreakBefore/>
+        <w:jc w:val="center"/>
+        <w:rPr>
+          <w:bCs/>
+        </w:rPr>
       </w:pPr>
       <w:r>
         <w:rPr>
@@ -8511,7 +8570,15 @@
           <w:sz w:val="20"/>
         </w:rPr>
         <w:lastRenderedPageBreak/>
-        <w:t>Table S7. Phase boundaries for the primary decay fraction of 0.50</w:t>
+        <w:t xml:space="preserve">Table S7. </w:t>
+      </w:r>
+      <w:r>
+        <w:rPr>
+          <w:rFonts w:ascii="Times New Roman" w:hAnsi="Times New Roman"/>
+          <w:bCs/>
+          <w:sz w:val="20"/>
+        </w:rPr>
+        <w:t>Phase boundaries for the primary decay fraction of 0.50</w:t>
       </w:r>
     </w:p>
     <w:tbl>
@@ -9659,6 +9726,10 @@
       <w:pPr>
         <w:keepNext/>
         <w:pageBreakBefore/>
+        <w:jc w:val="center"/>
+        <w:rPr>
+          <w:bCs/>
+        </w:rPr>
       </w:pPr>
       <w:r>
         <w:rPr>
@@ -9667,7 +9738,15 @@
           <w:sz w:val="20"/>
         </w:rPr>
         <w:lastRenderedPageBreak/>
-        <w:t>Table S8. Three-station phase-specific paired profile-error differences</w:t>
+        <w:t xml:space="preserve">Table S8. </w:t>
+      </w:r>
+      <w:r>
+        <w:rPr>
+          <w:rFonts w:ascii="Times New Roman" w:hAnsi="Times New Roman"/>
+          <w:bCs/>
+          <w:sz w:val="20"/>
+        </w:rPr>
+        <w:t>Three-station phase-specific paired profile-error differences</w:t>
       </w:r>
     </w:p>
     <w:tbl>
@@ -11395,29 +11474,13 @@
       </w:r>
     </w:p>
     <w:p>
-      <w:pPr>
-        <w:keepNext/>
-        <w:keepLines/>
-        <w:pageBreakBefore/>
-        <w:jc w:val="both"/>
-      </w:pPr>
-      <w:r>
-        <w:rPr>
-          <w:rFonts w:ascii="Times New Roman" w:hAnsi="Times New Roman"/>
-          <w:sz w:val="20"/>
-        </w:rPr>
-        <w:lastRenderedPageBreak/>
-        <w:t>Fig. S1. Forward-sequence evaluation after selecting and freezing each layout from EQM1. Each point is the median across available piles within the later earthquake. Negative candidate-minus-uniform p90 NRMSE favours the frozen layout; the zero line denotes a tie. Source: Data from Sinha et al. (2020a, b).</w:t>
-      </w:r>
-    </w:p>
-    <w:p>
       <w:r>
         <w:rPr>
           <w:noProof/>
         </w:rPr>
         <w:drawing>
-          <wp:inline distT="0" distB="0" distL="0" distR="0" wp14:anchorId="6959607E" wp14:editId="24D7AFB2">
-            <wp:extent cx="5943600" cy="3566160"/>
+          <wp:inline distT="0" distB="0" distL="0" distR="0" wp14:anchorId="6959607E" wp14:editId="7F488E0E">
+            <wp:extent cx="5943600" cy="3105150"/>
             <wp:effectExtent l="0" t="0" r="0" b="0"/>
             <wp:docPr id="1" name="Picture 1"/>
             <wp:cNvGraphicFramePr>
@@ -11439,7 +11502,7 @@
                   <pic:spPr>
                     <a:xfrm>
                       <a:off x="0" y="0"/>
-                      <a:ext cx="5943600" cy="3566160"/>
+                      <a:ext cx="5943600" cy="3105150"/>
                     </a:xfrm>
                     <a:prstGeom prst="rect">
                       <a:avLst/>
@@ -11454,33 +11517,64 @@
     </w:p>
     <w:p>
       <w:pPr>
-        <w:keepNext/>
-        <w:keepLines/>
-        <w:pageBreakBefore/>
-        <w:jc w:val="both"/>
+        <w:jc w:val="center"/>
+        <w:rPr>
+          <w:rFonts w:ascii="Times New Roman" w:hAnsi="Times New Roman" w:cs="Times New Roman"/>
+          <w:sz w:val="20"/>
+          <w:szCs w:val="20"/>
+        </w:rPr>
       </w:pPr>
       <w:r>
         <w:rPr>
-          <w:rFonts w:ascii="Times New Roman" w:hAnsi="Times New Roman"/>
+          <w:rFonts w:ascii="Times New Roman" w:hAnsi="Times New Roman" w:cs="Times New Roman"/>
           <w:b/>
+          <w:bCs/>
           <w:sz w:val="20"/>
+          <w:szCs w:val="20"/>
         </w:rPr>
-        <w:lastRenderedPageBreak/>
-        <w:t xml:space="preserve">Fig. S2. </w:t>
+        <w:t>Fig. S1.</w:t>
       </w:r>
       <w:r>
         <w:rPr>
-          <w:rFonts w:ascii="Times New Roman" w:hAnsi="Times New Roman"/>
+          <w:rFonts w:ascii="Times New Roman" w:hAnsi="Times New Roman" w:cs="Times New Roman"/>
           <w:sz w:val="20"/>
+          <w:szCs w:val="20"/>
         </w:rPr>
-        <w:t>Robustness envelopes across four smoothing choices and three NRMSE floors. Points denote the implemented nominal specification; vertical ranges show the minimum and maximum median paired change across all 12 specifications. These are specification envelopes, not confidence intervals. Source: Data from Sinha et al. (2020a, b).</w:t>
+        <w:t xml:space="preserve"> Forward-sequence evaluation after selecting and freezing each layout from EQM1. Each point is the median across available piles within the later earthquake. Negative candidate-minus-uniform p90 NRMSE </w:t>
       </w:r>
+      <w:proofErr w:type="spellStart"/>
+      <w:r>
+        <w:rPr>
+          <w:rFonts w:ascii="Times New Roman" w:hAnsi="Times New Roman" w:cs="Times New Roman"/>
+          <w:sz w:val="20"/>
+          <w:szCs w:val="20"/>
+        </w:rPr>
+        <w:t>favours</w:t>
+      </w:r>
+      <w:proofErr w:type="spellEnd"/>
+      <w:r>
+        <w:rPr>
+          <w:rFonts w:ascii="Times New Roman" w:hAnsi="Times New Roman" w:cs="Times New Roman"/>
+          <w:sz w:val="20"/>
+          <w:szCs w:val="20"/>
+        </w:rPr>
+        <w:t xml:space="preserve"> the frozen layout; the zero line denotes a tie. Source: Data from Sinha et al. (2020a, b).</w:t>
+      </w:r>
+    </w:p>
+    <w:p>
+      <w:pPr>
+        <w:jc w:val="center"/>
+        <w:rPr>
+          <w:rFonts w:ascii="Times New Roman" w:hAnsi="Times New Roman" w:cs="Times New Roman"/>
+        </w:rPr>
+      </w:pPr>
     </w:p>
     <w:p>
       <w:r>
         <w:rPr>
           <w:noProof/>
         </w:rPr>
+        <w:lastRenderedPageBreak/>
         <w:drawing>
           <wp:inline distT="0" distB="0" distL="0" distR="0" wp14:anchorId="017C050D" wp14:editId="0DDA7ED8">
             <wp:extent cx="5943600" cy="3566160"/>
@@ -11520,20 +11614,33 @@
     </w:p>
     <w:p>
       <w:pPr>
-        <w:keepNext/>
-        <w:keepLines/>
-        <w:pageBreakBefore/>
-        <w:jc w:val="both"/>
+        <w:pStyle w:val="NoSpacing"/>
+        <w:jc w:val="center"/>
+        <w:rPr>
+          <w:rFonts w:ascii="Times New Roman" w:hAnsi="Times New Roman" w:cs="Times New Roman"/>
+          <w:sz w:val="20"/>
+          <w:szCs w:val="20"/>
+        </w:rPr>
       </w:pPr>
       <w:r>
         <w:rPr>
-          <w:rFonts w:ascii="Times New Roman" w:hAnsi="Times New Roman"/>
+          <w:rFonts w:ascii="Times New Roman" w:hAnsi="Times New Roman" w:cs="Times New Roman"/>
+          <w:b/>
           <w:sz w:val="20"/>
+          <w:szCs w:val="20"/>
         </w:rPr>
-        <w:lastRenderedPageBreak/>
-        <w:t>Fig. S3. Co-located physical-regime descriptors and transfer error for the three-added-station comparison. Panels distinguish the centrifuge tests; labels identify earthquakes. Pore-pressure ratio describes the observed test envelope only. No regression significance or causal relation is claimed. Source: Data from Sinha et al. (2020a, b).</w:t>
+        <w:t xml:space="preserve">Fig. S2. </w:t>
+      </w:r>
+      <w:r>
+        <w:rPr>
+          <w:rFonts w:ascii="Times New Roman" w:hAnsi="Times New Roman" w:cs="Times New Roman"/>
+          <w:sz w:val="20"/>
+          <w:szCs w:val="20"/>
+        </w:rPr>
+        <w:t>Robustness envelopes across four smoothing choices and three NRMSE floors. Points denote the implemented nominal specification; vertical ranges show the minimum and maximum median paired change across all 12 specifications. These are specification envelopes, not confidence intervals. Source: Data from Sinha et al. (2020a, b).</w:t>
       </w:r>
     </w:p>
+    <w:p/>
     <w:p>
       <w:r>
         <w:rPr>
@@ -11579,26 +11686,29 @@
     <w:p>
       <w:pPr>
         <w:keepNext/>
+        <w:keepLines/>
         <w:pageBreakBefore/>
-        <w:jc w:val="both"/>
+        <w:jc w:val="center"/>
       </w:pPr>
       <w:r>
         <w:rPr>
           <w:rFonts w:ascii="Times New Roman" w:hAnsi="Times New Roman"/>
           <w:b/>
+          <w:bCs/>
           <w:sz w:val="20"/>
         </w:rPr>
         <w:lastRenderedPageBreak/>
-        <w:t xml:space="preserve">Fig. S4. </w:t>
+        <w:t>Fig. S3.</w:t>
       </w:r>
       <w:r>
         <w:rPr>
           <w:rFonts w:ascii="Times New Roman" w:hAnsi="Times New Roman"/>
           <w:sz w:val="20"/>
         </w:rPr>
-        <w:t>Phase-specific transfer of frozen three-station layouts. Dots show paired earthquake-level differences in phase p90 profile NRMSE; black bars show their medians. Original and boundary-retained layouts share the equal-budget uniform comparator. The decay boundary is a sustained reduction below half the reference pressure-proxy peak, not complete dissipation. Five post-shaking events are available in each direction because SKS02 EQM1 has weak pressure response; shaking uses six SKS02 and five SKS03 events. The 120-snapshot, elapsed-time-smoothed setting is shown; full sensitivities and peak-response errors are provided as CSV files. Source: Sinha et al. (2020a, b).</w:t>
+        <w:t xml:space="preserve"> Co-located physical-regime descriptors and transfer error for the three-added-station comparison. Panels distinguish the centrifuge tests; labels identify earthquakes. Pore-pressure ratio describes the observed test envelope only. No regression significance or causal relation is claimed. Source: Data from Sinha et al. (2020a, b).</w:t>
       </w:r>
     </w:p>
+    <w:p/>
     <w:p>
       <w:pPr>
         <w:spacing w:line="240" w:lineRule="auto"/>
@@ -11645,6 +11755,36 @@
       </w:r>
     </w:p>
     <w:p>
+      <w:pPr>
+        <w:pStyle w:val="NoSpacing"/>
+        <w:spacing w:line="480" w:lineRule="auto"/>
+        <w:jc w:val="center"/>
+        <w:rPr>
+          <w:rFonts w:ascii="Times New Roman" w:hAnsi="Times New Roman" w:cs="Times New Roman"/>
+          <w:sz w:val="20"/>
+          <w:szCs w:val="20"/>
+        </w:rPr>
+      </w:pPr>
+      <w:r>
+        <w:rPr>
+          <w:rFonts w:ascii="Times New Roman" w:hAnsi="Times New Roman" w:cs="Times New Roman"/>
+          <w:b/>
+          <w:sz w:val="20"/>
+          <w:szCs w:val="20"/>
+        </w:rPr>
+        <w:t xml:space="preserve">Fig. S4. </w:t>
+      </w:r>
+      <w:r>
+        <w:rPr>
+          <w:rFonts w:ascii="Times New Roman" w:hAnsi="Times New Roman" w:cs="Times New Roman"/>
+          <w:sz w:val="20"/>
+          <w:szCs w:val="20"/>
+        </w:rPr>
+        <w:t>Phase-specific transfer of frozen three-station layouts. Dots show paired earthquake-level differences in phase p90 profile NRMSE; black bars show their medians. Original and boundary-retained layouts share the equal-budget uniform comparator. The decay boundary is a sustained reduction below half the reference pressure-proxy peak, not complete dissipation. Five post-shaking events are available in each direction because SKS02 EQM1 has weak pressure response; shaking uses six SKS02 and five SKS03 events. The 120-snapshot, elapsed-time-smoothed setting is shown; full sensitivities and peak-response errors are provided as CSV files. Source: Sinha et al. (2020a, b).</w:t>
+      </w:r>
+    </w:p>
+    <w:p/>
+    <w:p>
       <w:r>
         <w:rPr>
           <w:rFonts w:ascii="Times New Roman" w:hAnsi="Times New Roman"/>
@@ -11669,6 +11809,7 @@
           <w:rFonts w:ascii="Times New Roman" w:hAnsi="Times New Roman"/>
           <w:sz w:val="20"/>
         </w:rPr>
+        <w:lastRenderedPageBreak/>
         <w:t>Duffy, K., K. G. Gavin, D. A. de Lange, and M. Korff. 2025. “Static load tests on screw injection piles with distributed fibre optic sensors in Delft.” Dataset. 4TU.ResearchData. https://doi.org/10.4121/78720ecb-daf4-4676-b5f4-281e93e4388a.</w:t>
       </w:r>
     </w:p>

</xml_diff>